<commit_message>
Embed the Workiva Copy dialog screenshots in the guide
Se agregan las tres capturas del workspace (menu contextual, Copy includes con el desplegable de links abierto, y Smart links con Location Settings) al documento, con pie de foto, y se guardan en docs/img para regenerar el Word.

Co-Authored-By: Claude Opus 5 <noreply@anthropic.com>
Claude-Session: https://claude.ai/code/session_01HWTsKohayaRAntsaE8oDRJ
</commit_message>
<xml_diff>
--- a/docs/Guia_Copias_Workiva.docx
+++ b/docs/Guia_Copias_Workiva.docx
@@ -309,6 +309,69 @@
     </w:p>
     <w:p>
       <w:pPr>
+        <w:spacing w:after="60" w:before="100"/>
+        <w:jc w:val="center"/>
+      </w:pPr>
+      <w:r>
+        <w:drawing>
+          <wp:inline distT="0" distB="0" distL="0" distR="0">
+            <wp:extent cx="3543300" cy="4810125"/>
+            <wp:effectExtent t="0" r="0" b="0" l="0"/>
+            <wp:docPr id="1" name="" descr="" title=""/>
+            <wp:cNvGraphicFramePr>
+              <a:graphicFrameLocks xmlns:a="http://schemas.openxmlformats.org/drawingml/2006/main" noChangeAspect="1"/>
+            </wp:cNvGraphicFramePr>
+            <a:graphic xmlns:a="http://schemas.openxmlformats.org/drawingml/2006/main">
+              <a:graphicData uri="http://schemas.openxmlformats.org/drawingml/2006/picture">
+                <pic:pic xmlns:pic="http://schemas.openxmlformats.org/drawingml/2006/picture">
+                  <pic:nvPicPr>
+                    <pic:cNvPr id="0" name="" descr=""/>
+                    <pic:cNvPicPr>
+                      <a:picLocks noChangeAspect="1" noChangeArrowheads="1"/>
+                    </pic:cNvPicPr>
+                  </pic:nvPicPr>
+                  <pic:blipFill>
+                    <a:blip r:embed="rId7" cstate="none"/>
+                    <a:srcRect/>
+                    <a:stretch>
+                      <a:fillRect/>
+                    </a:stretch>
+                  </pic:blipFill>
+                  <pic:spPr bwMode="auto">
+                    <a:xfrm>
+                      <a:off x="0" y="0"/>
+                      <a:ext cx="3543300" cy="4810125"/>
+                    </a:xfrm>
+                    <a:prstGeom prst="rect">
+                      <a:avLst/>
+                    </a:prstGeom>
+                  </pic:spPr>
+                </pic:pic>
+              </a:graphicData>
+            </a:graphic>
+          </wp:inline>
+        </w:drawing>
+      </w:r>
+    </w:p>
+    <w:p>
+      <w:pPr>
+        <w:spacing w:after="200"/>
+        <w:jc w:val="center"/>
+      </w:pPr>
+      <w:r>
+        <w:rPr>
+          <w:rFonts w:ascii="Calibri" w:cs="Calibri" w:eastAsia="Calibri" w:hAnsi="Calibri"/>
+          <w:i/>
+          <w:iCs/>
+          <w:color w:val="777777"/>
+          <w:sz w:val="18"/>
+          <w:szCs w:val="18"/>
+        </w:rPr>
+        <w:t xml:space="preserve">Paso 1: clic derecho sobre la carpeta y elegir Copy. Ojo: Copy URL solo copia el vínculo y Move no deja duplicado.</w:t>
+      </w:r>
+    </w:p>
+    <w:p>
+      <w:pPr>
         <w:pStyle w:val="Heading1"/>
         <w:pBdr>
           <w:bottom w:val="single" w:color="2E5C9A" w:sz="8" w:space="4"/>
@@ -342,6 +405,69 @@
     </w:p>
     <w:p>
       <w:pPr>
+        <w:spacing w:after="60" w:before="100"/>
+        <w:jc w:val="center"/>
+      </w:pPr>
+      <w:r>
+        <w:drawing>
+          <wp:inline distT="0" distB="0" distL="0" distR="0">
+            <wp:extent cx="5905500" cy="5657850"/>
+            <wp:effectExtent t="0" r="0" b="0" l="0"/>
+            <wp:docPr id="1" name="" descr="" title=""/>
+            <wp:cNvGraphicFramePr>
+              <a:graphicFrameLocks xmlns:a="http://schemas.openxmlformats.org/drawingml/2006/main" noChangeAspect="1"/>
+            </wp:cNvGraphicFramePr>
+            <a:graphic xmlns:a="http://schemas.openxmlformats.org/drawingml/2006/main">
+              <a:graphicData uri="http://schemas.openxmlformats.org/drawingml/2006/picture">
+                <pic:pic xmlns:pic="http://schemas.openxmlformats.org/drawingml/2006/picture">
+                  <pic:nvPicPr>
+                    <pic:cNvPr id="0" name="" descr=""/>
+                    <pic:cNvPicPr>
+                      <a:picLocks noChangeAspect="1" noChangeArrowheads="1"/>
+                    </pic:cNvPicPr>
+                  </pic:nvPicPr>
+                  <pic:blipFill>
+                    <a:blip r:embed="rId8" cstate="none"/>
+                    <a:srcRect/>
+                    <a:stretch>
+                      <a:fillRect/>
+                    </a:stretch>
+                  </pic:blipFill>
+                  <pic:spPr bwMode="auto">
+                    <a:xfrm>
+                      <a:off x="0" y="0"/>
+                      <a:ext cx="5905500" cy="5657850"/>
+                    </a:xfrm>
+                    <a:prstGeom prst="rect">
+                      <a:avLst/>
+                    </a:prstGeom>
+                  </pic:spPr>
+                </pic:pic>
+              </a:graphicData>
+            </a:graphic>
+          </wp:inline>
+        </w:drawing>
+      </w:r>
+    </w:p>
+    <w:p>
+      <w:pPr>
+        <w:spacing w:after="200"/>
+        <w:jc w:val="center"/>
+      </w:pPr>
+      <w:r>
+        <w:rPr>
+          <w:rFonts w:ascii="Calibri" w:cs="Calibri" w:eastAsia="Calibri" w:hAnsi="Calibri"/>
+          <w:i/>
+          <w:iCs/>
+          <w:color w:val="777777"/>
+          <w:sz w:val="18"/>
+          <w:szCs w:val="18"/>
+        </w:rPr>
+        <w:t xml:space="preserve">Pasos 3 y 4: las casillas de Copy includes y el desplegable de links abierto con sus dos opciones.</w:t>
+      </w:r>
+    </w:p>
+    <w:p>
+      <w:pPr>
         <w:pStyle w:val="ListParagraph"/>
         <w:numPr>
           <w:ilvl w:val="0"/>
@@ -734,6 +860,69 @@
           <w:szCs w:val="21"/>
         </w:rPr>
         <w:t xml:space="preserve">Elegir mal deja el período nuevo mostrando cifras del anterior, o llena el workspace de duplicados que nadie pidió.</w:t>
+      </w:r>
+    </w:p>
+    <w:p>
+      <w:pPr>
+        <w:spacing w:after="60" w:before="100"/>
+        <w:jc w:val="center"/>
+      </w:pPr>
+      <w:r>
+        <w:drawing>
+          <wp:inline distT="0" distB="0" distL="0" distR="0">
+            <wp:extent cx="5905500" cy="3629025"/>
+            <wp:effectExtent t="0" r="0" b="0" l="0"/>
+            <wp:docPr id="1" name="" descr="" title=""/>
+            <wp:cNvGraphicFramePr>
+              <a:graphicFrameLocks xmlns:a="http://schemas.openxmlformats.org/drawingml/2006/main" noChangeAspect="1"/>
+            </wp:cNvGraphicFramePr>
+            <a:graphic xmlns:a="http://schemas.openxmlformats.org/drawingml/2006/main">
+              <a:graphicData uri="http://schemas.openxmlformats.org/drawingml/2006/picture">
+                <pic:pic xmlns:pic="http://schemas.openxmlformats.org/drawingml/2006/picture">
+                  <pic:nvPicPr>
+                    <pic:cNvPr id="0" name="" descr=""/>
+                    <pic:cNvPicPr>
+                      <a:picLocks noChangeAspect="1" noChangeArrowheads="1"/>
+                    </pic:cNvPicPr>
+                  </pic:nvPicPr>
+                  <pic:blipFill>
+                    <a:blip r:embed="rId9" cstate="none"/>
+                    <a:srcRect/>
+                    <a:stretch>
+                      <a:fillRect/>
+                    </a:stretch>
+                  </pic:blipFill>
+                  <pic:spPr bwMode="auto">
+                    <a:xfrm>
+                      <a:off x="0" y="0"/>
+                      <a:ext cx="5905500" cy="3629025"/>
+                    </a:xfrm>
+                    <a:prstGeom prst="rect">
+                      <a:avLst/>
+                    </a:prstGeom>
+                  </pic:spPr>
+                </pic:pic>
+              </a:graphicData>
+            </a:graphic>
+          </wp:inline>
+        </w:drawing>
+      </w:r>
+    </w:p>
+    <w:p>
+      <w:pPr>
+        <w:spacing w:after="200"/>
+        <w:jc w:val="center"/>
+      </w:pPr>
+      <w:r>
+        <w:rPr>
+          <w:rFonts w:ascii="Calibri" w:cs="Calibri" w:eastAsia="Calibri" w:hAnsi="Calibri"/>
+          <w:i/>
+          <w:iCs/>
+          <w:color w:val="777777"/>
+          <w:sz w:val="18"/>
+          <w:szCs w:val="18"/>
+        </w:rPr>
+        <w:t xml:space="preserve">Las dos casillas de Smart links van marcadas. Abajo, New Folder Name es obligatorio y Location define dónde queda la copia.</w:t>
       </w:r>
     </w:p>
     <w:p>

</xml_diff>